<commit_message>
Adiciona GitHub ao relatório final
</commit_message>
<xml_diff>
--- a/relatorios/Relatorio_Final_VCapital.docx
+++ b/relatorios/Relatorio_Final_VCapital.docx
@@ -131,6 +131,7 @@
     </w:p>
     <w:p>
       <w:pPr>
+        <w:spacing w:after="120"/>
         <w:jc w:val="center"/>
       </w:pPr>
       <w:r>
@@ -140,8 +141,31 @@
           <w:color w:val="666666"/>
           <w:sz w:val="20"/>
         </w:rPr>
-        <w:t>Versão 1.0 | Dados até julho de 2026</w:t>
+        <w:t>Versão 1.1 | Dados até julho de 2026</w:t>
       </w:r>
+    </w:p>
+    <w:p>
+      <w:pPr>
+        <w:spacing w:after="0"/>
+        <w:jc w:val="center"/>
+      </w:pPr>
+      <w:r>
+        <w:rPr>
+          <w:rFonts w:ascii="Calibri" w:hAnsi="Calibri"/>
+          <w:color w:val="666666"/>
+          <w:sz w:val="19"/>
+        </w:rPr>
+        <w:t xml:space="preserve">Repositório oficial: </w:t>
+      </w:r>
+      <w:hyperlink r:id="rId13">
+        <w:r>
+          <w:rPr>
+            <w:color w:val="2E74B5"/>
+            <w:u w:val="single"/>
+          </w:rPr>
+          <w:t>github.com/arthur1535/iitauquant</w:t>
+        </w:r>
+      </w:hyperlink>
     </w:p>
     <w:p>
       <w:r>
@@ -3319,7 +3343,7 @@
                     <pic:cNvPicPr/>
                   </pic:nvPicPr>
                   <pic:blipFill>
-                    <a:blip r:embed="rId13"/>
+                    <a:blip r:embed="rId14"/>
                     <a:stretch>
                       <a:fillRect/>
                     </a:stretch>
@@ -3404,7 +3428,7 @@
                     <pic:cNvPicPr/>
                   </pic:nvPicPr>
                   <pic:blipFill>
-                    <a:blip r:embed="rId14"/>
+                    <a:blip r:embed="rId15"/>
                     <a:stretch>
                       <a:fillRect/>
                     </a:stretch>
@@ -3986,7 +4010,7 @@
                     <pic:cNvPicPr/>
                   </pic:nvPicPr>
                   <pic:blipFill>
-                    <a:blip r:embed="rId15"/>
+                    <a:blip r:embed="rId16"/>
                     <a:stretch>
                       <a:fillRect/>
                     </a:stretch>
@@ -4076,7 +4100,7 @@
                     <pic:cNvPicPr/>
                   </pic:nvPicPr>
                   <pic:blipFill>
-                    <a:blip r:embed="rId16"/>
+                    <a:blip r:embed="rId17"/>
                     <a:stretch>
                       <a:fillRect/>
                     </a:stretch>
@@ -5168,9 +5192,34 @@
           <w:color w:val="222222"/>
           <w:sz w:val="19"/>
         </w:rPr>
+        <w:t xml:space="preserve">VCapital. Repositório oficial do projeto iitauquant, contendo código, dados, testes, resultados reproduzíveis e os arquivos deste relatório. </w:t>
+      </w:r>
+      <w:hyperlink r:id="rId13">
+        <w:r>
+          <w:rPr>
+            <w:color w:val="2E74B5"/>
+            <w:u w:val="single"/>
+          </w:rPr>
+          <w:t>GitHub - arthur1535/iitauquant</w:t>
+        </w:r>
+      </w:hyperlink>
+    </w:p>
+    <w:p>
+      <w:pPr>
+        <w:spacing w:after="120"/>
+        <w:ind w:left="259" w:hanging="259"/>
+        <w:keepLines/>
+        <w:widowControl/>
+      </w:pPr>
+      <w:r>
+        <w:rPr>
+          <w:rFonts w:ascii="Calibri" w:hAnsi="Calibri"/>
+          <w:color w:val="222222"/>
+          <w:sz w:val="19"/>
+        </w:rPr>
         <w:t xml:space="preserve">Federal Reserve Bank of St. Louis. BAA10Y: Moody's Seasoned Baa Corporate Bond Yield Relative to Yield on 10-Year Treasury Constant Maturity. Série diária; histórico desde 1986. Acesso em 2 ago. 2026. </w:t>
       </w:r>
-      <w:hyperlink r:id="rId17">
+      <w:hyperlink r:id="rId18">
         <w:r>
           <w:rPr>
             <w:color w:val="2E74B5"/>
@@ -5195,7 +5244,7 @@
         </w:rPr>
         <w:t xml:space="preserve">ICE Data Indices / FRED. BAMLH0A0HYM2: ICE BofA US High Yield Index Option-Adjusted Spread. Nota de que, a partir de abril de 2026, a série inclui somente três anos de observações. Acesso em 2 ago. 2026. </w:t>
       </w:r>
-      <w:hyperlink r:id="rId18">
+      <w:hyperlink r:id="rId19">
         <w:r>
           <w:rPr>
             <w:color w:val="2E74B5"/>
@@ -5220,7 +5269,7 @@
         </w:rPr>
         <w:t xml:space="preserve">U.S. Securities and Exchange Commission. EDGAR Application Programming Interfaces: submissions e XBRL companyfacts. Acesso em 2 ago. 2026. </w:t>
       </w:r>
-      <w:hyperlink r:id="rId19">
+      <w:hyperlink r:id="rId20">
         <w:r>
           <w:rPr>
             <w:color w:val="2E74B5"/>
@@ -5245,7 +5294,7 @@
         </w:rPr>
         <w:t xml:space="preserve">Kenneth R. French. Data Library: fatores Fama-French e Momentum. Acesso em 2 ago. 2026. </w:t>
       </w:r>
-      <w:hyperlink r:id="rId20">
+      <w:hyperlink r:id="rId21">
         <w:r>
           <w:rPr>
             <w:color w:val="2E74B5"/>

</xml_diff>